<commit_message>
Enrich Table 1 fecundity provenance (Pinon-Gonzalez 2018, Chamberland 2016)
Adds the fertilization-success source behind y_e and the Chamberland 2016
support for SC3 reproduction, matching the fecundity citation set agreed
in the Apr 2026 size-dependent fecundity discussion.

Co-Authored-By: Claude Opus 4.8 (1M context) <noreply@anthropic.com>
</commit_message>
<xml_diff>
--- a/tables/parameter_tables.docx
+++ b/tables/parameter_tables.docx
@@ -2021,7 +2021,7 @@
                 <w:szCs w:val="18"/>
                 <w:color w:val="000000"/>
               </w:rPr>
-              <w:t xml:space="preserve">Soong &amp; Lang 1992</w:t>
+              <w:t xml:space="preserve">Soong &amp; Lang 1992 (SC3 reproduction supported by Chamberland et al. 2016)</w:t>
             </w:r>
           </w:p>
         </w:tc>
@@ -2465,7 +2465,7 @@
                 <w:szCs w:val="18"/>
                 <w:color w:val="000000"/>
               </w:rPr>
-              <w:t xml:space="preserve">Calibrated to Fundemar 2025 collection (assumed SC4 colonies)</w:t>
+              <w:t xml:space="preserve">Calibrated to Fundemar 2025 collection, assumed SC4 colonies (consistent with ~71% fertilization, Pinon-Gonzalez 2018)</w:t>
             </w:r>
           </w:p>
         </w:tc>

</xml_diff>